<commit_message>
Correct recovery and parsing failures and clarify simulation boundaries
</commit_message>
<xml_diff>
--- a/public/article/ocr-rush-companion.docx
+++ b/public/article/ocr-rush-companion.docx
@@ -51,7 +51,7 @@
           <w:b w:val="0"/>
           <w:i w:val="0"/>
         </w:rPr>
-        <w:t>. That AWS implementation is the starting point for the game I’ve built, OCR Rush. I recommend taking the course to learn how the application is put together, then using the game to practise running it under different workloads.</w:t>
+        <w:t>. I built OCR Rush around that application’s AWS services, with some changes that let you explore how it behaves. I recommend taking the course to learn how the application is put together, then using the game to practise running it under different workloads.</w:t>
       </w:r>
     </w:p>
     <w:p>
@@ -78,7 +78,7 @@
           <w:b w:val="0"/>
           <w:i w:val="0"/>
         </w:rPr>
-        <w:t>There are two main processing stages to keep in mind. First, the application prepares the PDF pages and locates the text and tables. Then an AI model reads that content. Both stages run on computers rented from Amazon Web Services (AWS), using GPUs, processors suited to this kind of AI work. The copies of software doing the processing are called workers. When they’re busy, incoming work waits in a queue until a worker is available.</w:t>
+        <w:t>There are two main processing stages to keep in mind. First, the application prepares the PDF pages and locates the text and tables. Then an AI model reads that content. Both stages run on computers rented from Amazon Web Services (AWS), using GPUs, processors suited to this kind of AI work. The copies of software doing the processing are called workers. When they’re busy, incoming work waits in a queue until a worker is available. In the game, each stage can take work independently. The course worker keeps a batch until both stages finish; the game’s extra queue lets you explore a different way to organise the processing.</w:t>
       </w:r>
     </w:p>
     <w:p>
@@ -126,7 +126,7 @@
           <w:i/>
           <w:sz w:val="20"/>
         </w:rPr>
-        <w:t>The application prepares pages and reads their contents in separate stages. Each stage has workers to do the processing and a queue for work that has to wait.</w:t>
+        <w:t>The game models a queue before each processing stage, so you can see where documents are waiting.</w:t>
       </w:r>
     </w:p>
     <w:p>
@@ -213,7 +213,7 @@
           <w:b w:val="0"/>
           <w:i w:val="0"/>
         </w:rPr>
-        <w:t xml:space="preserve">There is another detail to consider: an attempt might be repeated even though a result was already saved. Real cloud queues can </w:t>
+        <w:t xml:space="preserve">There is another detail to consider: a client may submit the same invoice again after its result was already saved. That is the second event in this level. Separately, real cloud queues can </w:t>
       </w:r>
       <w:hyperlink r:id="rId11">
         <w:r>
@@ -371,7 +371,7 @@
           <w:b w:val="0"/>
           <w:i w:val="0"/>
         </w:rPr>
-        <w:t>Each time you replay a level, the same documents arrive and the same failures happen. That makes it easier to judge a change. You can see whether starting the computers earlier helped, whether extra workers reduced the wait, or whether a recovery change allowed an interrupted document to finish.</w:t>
+        <w:t>Each time you replay a level, the same documents arrive and the same failure rules apply. In the recovery level, the interruption waits for a worker with documents in progress, so starting later cannot avoid the test. That makes it easier to judge a change. You can see whether starting the computers earlier helped, whether extra workers reduced the wait, or whether a recovery change allowed an interrupted document to finish.</w:t>
       </w:r>
     </w:p>
     <w:p>

</xml_diff>

<commit_message>
Clarify queue counts and sharing and add article contact links
</commit_message>
<xml_diff>
--- a/public/article/ocr-rush-companion.docx
+++ b/public/article/ocr-rush-companion.docx
@@ -423,6 +423,60 @@
         </w:r>
       </w:hyperlink>
     </w:p>
+    <w:p>
+      <w:r>
+        <w:rPr>
+          <w:b w:val="0"/>
+          <w:i w:val="0"/>
+        </w:rPr>
+        <w:t xml:space="preserve">For questions or discussion, you can find me on </w:t>
+      </w:r>
+      <w:hyperlink r:id="rId15">
+        <w:r>
+          <w:rPr>
+            <w:b w:val="0"/>
+            <w:i w:val="0"/>
+            <w:color w:val="0053B4"/>
+            <w:u w:val="single"/>
+          </w:rPr>
+          <w:t>Build With AWS</w:t>
+        </w:r>
+      </w:hyperlink>
+      <w:r>
+        <w:rPr>
+          <w:b w:val="0"/>
+          <w:i w:val="0"/>
+        </w:rPr>
+        <w:t xml:space="preserve"> or </w:t>
+      </w:r>
+      <w:hyperlink r:id="rId16">
+        <w:r>
+          <w:rPr>
+            <w:b w:val="0"/>
+            <w:i w:val="0"/>
+            <w:color w:val="0053B4"/>
+            <w:u w:val="single"/>
+          </w:rPr>
+          <w:t>LinkedIn</w:t>
+        </w:r>
+      </w:hyperlink>
+      <w:r>
+        <w:rPr>
+          <w:b w:val="0"/>
+          <w:i w:val="0"/>
+        </w:rPr>
+        <w:t>. I regularly share updates about AI systems and AWS architecture patterns.</w:t>
+      </w:r>
+    </w:p>
+    <w:p>
+      <w:r>
+        <w:rPr>
+          <w:b w:val="0"/>
+          <w:i w:val="0"/>
+        </w:rPr>
+        <w:t>Build something interesting with this, and then share what you learned!</w:t>
+      </w:r>
+    </w:p>
     <w:sectPr>
       <w:pgSz w:w="12240" w:h="15840"/>
       <w:pgMar w:top="1152" w:right="1152" w:bottom="1152" w:left="1152" w:header="720" w:footer="720" w:gutter="0"/>

</xml_diff>